<commit_message>
feat: purchase history panel (left-center scrollable list)
- add PurchaseHistoryManager singleton + PurchaseHistoryEntry row (icon + count)
- aggregate per item: repeat purchase increments the row count (xN) instead of a new row
- rows fill top-to-bottom in first-purchase order; hover shows tooltip via WeaponTooltip
- hook ShopManager.BuyWeapon/BuyUpgrade to record purchases
- scene UI on GameCanvas: scrollable panel anchored middle-left (ScrollRect + RectMask2D + VerticalLayoutGroup)
- add Assets/Prefab/UI/PurchaseHistoryEntry.prefab
</commit_message>
<xml_diff>
--- a/docs/История_изменений.docx
+++ b/docs/История_изменений.docx
@@ -47,7 +47,7 @@
           <w:b/>
           <w:sz w:val="22"/>
         </w:rPr>
-        <w:t xml:space="preserve">Всего коммитов: 11</w:t>
+        <w:t xml:space="preserve">Всего коммитов: 12</w:t>
       </w:r>
     </w:p>
     <w:p>
@@ -3260,6 +3260,158 @@
           <w:color w:val="666666"/>
           <w:sz w:val="20"/>
         </w:rPr>
+        <w:t xml:space="preserve">Коммит 386d316 · 2026-06-28</w:t>
+      </w:r>
+    </w:p>
+    <w:p>
+      <w:pPr>
+        <w:spacing w:after="40"/>
+      </w:pPr>
+      <w:r>
+        <w:rPr>
+          <w:b/>
+          <w:sz w:val="22"/>
+        </w:rPr>
+        <w:t xml:space="preserve">Описание:</w:t>
+      </w:r>
+    </w:p>
+    <w:p>
+      <w:pPr>
+        <w:numPr>
+          <w:ilvl w:val="0"/>
+          <w:numId w:val="1"/>
+        </w:numPr>
+        <w:spacing w:after="60"/>
+      </w:pPr>
+      <w:r>
+        <w:rPr>
+          <w:sz w:val="22"/>
+        </w:rPr>
+        <w:t xml:space="preserve">tools/gen_changelog.py rebuilds docs/История_изменений.docx from git history (BASE d839316..HEAD): one block per commit with type, title, hash, date, description (from the commit body) and touched files.</w:t>
+      </w:r>
+    </w:p>
+    <w:p>
+      <w:pPr>
+        <w:numPr>
+          <w:ilvl w:val="0"/>
+          <w:numId w:val="1"/>
+        </w:numPr>
+        <w:spacing w:after="60"/>
+      </w:pPr>
+      <w:r>
+        <w:rPr>
+          <w:sz w:val="22"/>
+        </w:rPr>
+        <w:t xml:space="preserve">Past commits always get correct hashes; --pending adds a temporary block for the commit being prepared, which self-heals into a real hashed block on the next run.</w:t>
+      </w:r>
+    </w:p>
+    <w:p>
+      <w:pPr>
+        <w:numPr>
+          <w:ilvl w:val="0"/>
+          <w:numId w:val="1"/>
+        </w:numPr>
+        <w:spacing w:after="60"/>
+      </w:pPr>
+      <w:r>
+        <w:rPr>
+          <w:sz w:val="22"/>
+        </w:rPr>
+        <w:t xml:space="preserve">Manual workflow (no git hook): git add changes; run the generator with --pending &lt;subject&gt;; git add the docx; commit.</w:t>
+      </w:r>
+    </w:p>
+    <w:p>
+      <w:pPr>
+        <w:spacing w:after="40"/>
+      </w:pPr>
+      <w:r>
+        <w:rPr>
+          <w:b/>
+          <w:sz w:val="22"/>
+        </w:rPr>
+        <w:t xml:space="preserve">Затронутые файлы:</w:t>
+      </w:r>
+    </w:p>
+    <w:p>
+      <w:pPr>
+        <w:numPr>
+          <w:ilvl w:val="0"/>
+          <w:numId w:val="1"/>
+        </w:numPr>
+        <w:spacing w:after="60"/>
+      </w:pPr>
+      <w:r>
+        <w:rPr>
+          <w:color w:val="333333"/>
+          <w:sz w:val="20"/>
+        </w:rPr>
+        <w:t xml:space="preserve">"docs/\320\230\321\201\321\202\320\276\321\200\320\270\321\217_\320\270\320\267\320\274\320\265\320\275\320\265\320\275\320\270\320\271.docx"</w:t>
+      </w:r>
+    </w:p>
+    <w:p>
+      <w:pPr>
+        <w:numPr>
+          <w:ilvl w:val="0"/>
+          <w:numId w:val="1"/>
+        </w:numPr>
+        <w:spacing w:after="60"/>
+      </w:pPr>
+      <w:r>
+        <w:rPr>
+          <w:color w:val="333333"/>
+          <w:sz w:val="20"/>
+        </w:rPr>
+        <w:t xml:space="preserve">tools/gen_changelog.py</w:t>
+      </w:r>
+    </w:p>
+    <w:p>
+      <w:pPr>
+        <w:spacing w:after="120"/>
+      </w:pPr>
+      <w:r>
+        <w:rPr>
+          <w:sz w:val="10"/>
+        </w:rPr>
+        <w:t xml:space="preserve"> </w:t>
+      </w:r>
+    </w:p>
+    <w:p>
+      <w:pPr>
+        <w:spacing w:after="40"/>
+      </w:pPr>
+      <w:r>
+        <w:rPr>
+          <w:b/>
+          <w:sz w:val="28"/>
+        </w:rPr>
+        <w:t xml:space="preserve">13. </w:t>
+      </w:r>
+      <w:r>
+        <w:rPr>
+          <w:b/>
+          <w:color w:val="1F7A1F"/>
+          <w:sz w:val="28"/>
+        </w:rPr>
+        <w:t xml:space="preserve">[FEAT] </w:t>
+      </w:r>
+      <w:r>
+        <w:rPr>
+          <w:b/>
+          <w:sz w:val="28"/>
+        </w:rPr>
+        <w:t xml:space="preserve">purchase history panel (left-center scrollable list)</w:t>
+      </w:r>
+    </w:p>
+    <w:p>
+      <w:pPr>
+        <w:spacing w:after="120"/>
+      </w:pPr>
+      <w:r>
+        <w:rPr>
+          <w:i/>
+          <w:color w:val="666666"/>
+          <w:sz w:val="20"/>
+        </w:rPr>
         <w:t xml:space="preserve">Коммит (готовится) · —  (блок обновится настоящим хэшем после коммита)</w:t>
       </w:r>
     </w:p>
@@ -3288,7 +3440,71 @@
           <w:color w:val="333333"/>
           <w:sz w:val="20"/>
         </w:rPr>
-        <w:t xml:space="preserve">tools/gen_changelog.py</w:t>
+        <w:t xml:space="preserve">Assets/Prefab/UI/PurchaseHistoryEntry.prefab</w:t>
+      </w:r>
+    </w:p>
+    <w:p>
+      <w:pPr>
+        <w:numPr>
+          <w:ilvl w:val="0"/>
+          <w:numId w:val="1"/>
+        </w:numPr>
+        <w:spacing w:after="60"/>
+      </w:pPr>
+      <w:r>
+        <w:rPr>
+          <w:color w:val="333333"/>
+          <w:sz w:val="20"/>
+        </w:rPr>
+        <w:t xml:space="preserve">Assets/Scenes/MainScene.unity</w:t>
+      </w:r>
+    </w:p>
+    <w:p>
+      <w:pPr>
+        <w:numPr>
+          <w:ilvl w:val="0"/>
+          <w:numId w:val="1"/>
+        </w:numPr>
+        <w:spacing w:after="60"/>
+      </w:pPr>
+      <w:r>
+        <w:rPr>
+          <w:color w:val="333333"/>
+          <w:sz w:val="20"/>
+        </w:rPr>
+        <w:t xml:space="preserve">Assets/Script/ShopManager.cs</w:t>
+      </w:r>
+    </w:p>
+    <w:p>
+      <w:pPr>
+        <w:numPr>
+          <w:ilvl w:val="0"/>
+          <w:numId w:val="1"/>
+        </w:numPr>
+        <w:spacing w:after="60"/>
+      </w:pPr>
+      <w:r>
+        <w:rPr>
+          <w:color w:val="333333"/>
+          <w:sz w:val="20"/>
+        </w:rPr>
+        <w:t xml:space="preserve">Assets/Script/UI/PurchaseHistoryEntry.cs</w:t>
+      </w:r>
+    </w:p>
+    <w:p>
+      <w:pPr>
+        <w:numPr>
+          <w:ilvl w:val="0"/>
+          <w:numId w:val="1"/>
+        </w:numPr>
+        <w:spacing w:after="60"/>
+      </w:pPr>
+      <w:r>
+        <w:rPr>
+          <w:color w:val="333333"/>
+          <w:sz w:val="20"/>
+        </w:rPr>
+        <w:t xml:space="preserve">Assets/Script/UI/PurchaseHistoryManager.cs</w:t>
       </w:r>
     </w:p>
     <w:p>

</xml_diff>

<commit_message>
fix: projectile bugs (ice arrow facing, missile orbiting, MagicCircle no damage)
- IceBullet flew sideways: Bullet aimed local +Y at travel, but the arrow mesh/collider long axis is +X. Added Bullet.rotationOffsetEuler and set (0,0,90) on IceBullet_Projectile so the tip points forward.
- Missles orbited targets forever: turn radius (~4.8u) exceeded the collider. MissileBullet now detonates on direct hit or at closest approach (proximity fuse) and shares HitEnemy(); prefab turnSpeed 360 -> 1080.
- MagicCircle dealt no damage: SpawnBulletOffset never forwarded damage to the child ScalingWave, and ScalingWave relied on a growing trigger with no Rigidbody (+ null pooledObject.Release in Awake). SpawnBulletOffset now forwards damage via ScalingWave.Configure; ScalingWave damages by position via EnemyManager.GetEnemiesInRange (once per enemy), NRE removed.
</commit_message>
<xml_diff>
--- a/docs/История_изменений.docx
+++ b/docs/История_изменений.docx
@@ -47,7 +47,7 @@
           <w:b/>
           <w:sz w:val="22"/>
         </w:rPr>
-        <w:t xml:space="preserve">Всего коммитов: 12</w:t>
+        <w:t xml:space="preserve">Всего коммитов: 13</w:t>
       </w:r>
     </w:p>
     <w:p>
@@ -3412,6 +3412,267 @@
           <w:color w:val="666666"/>
           <w:sz w:val="20"/>
         </w:rPr>
+        <w:t xml:space="preserve">Коммит caa9702 · 2026-07-04</w:t>
+      </w:r>
+    </w:p>
+    <w:p>
+      <w:pPr>
+        <w:spacing w:after="40"/>
+      </w:pPr>
+      <w:r>
+        <w:rPr>
+          <w:b/>
+          <w:sz w:val="22"/>
+        </w:rPr>
+        <w:t xml:space="preserve">Описание:</w:t>
+      </w:r>
+    </w:p>
+    <w:p>
+      <w:pPr>
+        <w:numPr>
+          <w:ilvl w:val="0"/>
+          <w:numId w:val="1"/>
+        </w:numPr>
+        <w:spacing w:after="60"/>
+      </w:pPr>
+      <w:r>
+        <w:rPr>
+          <w:sz w:val="22"/>
+        </w:rPr>
+        <w:t xml:space="preserve">add PurchaseHistoryManager singleton + PurchaseHistoryEntry row (icon + count)</w:t>
+      </w:r>
+    </w:p>
+    <w:p>
+      <w:pPr>
+        <w:numPr>
+          <w:ilvl w:val="0"/>
+          <w:numId w:val="1"/>
+        </w:numPr>
+        <w:spacing w:after="60"/>
+      </w:pPr>
+      <w:r>
+        <w:rPr>
+          <w:sz w:val="22"/>
+        </w:rPr>
+        <w:t xml:space="preserve">aggregate per item: repeat purchase increments the row count (xN) instead of a new row</w:t>
+      </w:r>
+    </w:p>
+    <w:p>
+      <w:pPr>
+        <w:numPr>
+          <w:ilvl w:val="0"/>
+          <w:numId w:val="1"/>
+        </w:numPr>
+        <w:spacing w:after="60"/>
+      </w:pPr>
+      <w:r>
+        <w:rPr>
+          <w:sz w:val="22"/>
+        </w:rPr>
+        <w:t xml:space="preserve">rows fill top-to-bottom in first-purchase order; hover shows tooltip via WeaponTooltip</w:t>
+      </w:r>
+    </w:p>
+    <w:p>
+      <w:pPr>
+        <w:numPr>
+          <w:ilvl w:val="0"/>
+          <w:numId w:val="1"/>
+        </w:numPr>
+        <w:spacing w:after="60"/>
+      </w:pPr>
+      <w:r>
+        <w:rPr>
+          <w:sz w:val="22"/>
+        </w:rPr>
+        <w:t xml:space="preserve">hook ShopManager.BuyWeapon/BuyUpgrade to record purchases</w:t>
+      </w:r>
+    </w:p>
+    <w:p>
+      <w:pPr>
+        <w:numPr>
+          <w:ilvl w:val="0"/>
+          <w:numId w:val="1"/>
+        </w:numPr>
+        <w:spacing w:after="60"/>
+      </w:pPr>
+      <w:r>
+        <w:rPr>
+          <w:sz w:val="22"/>
+        </w:rPr>
+        <w:t xml:space="preserve">scene UI on GameCanvas: scrollable panel anchored middle-left (ScrollRect + RectMask2D + VerticalLayoutGroup)</w:t>
+      </w:r>
+    </w:p>
+    <w:p>
+      <w:pPr>
+        <w:numPr>
+          <w:ilvl w:val="0"/>
+          <w:numId w:val="1"/>
+        </w:numPr>
+        <w:spacing w:after="60"/>
+      </w:pPr>
+      <w:r>
+        <w:rPr>
+          <w:sz w:val="22"/>
+        </w:rPr>
+        <w:t xml:space="preserve">add Assets/Prefab/UI/PurchaseHistoryEntry.prefab</w:t>
+      </w:r>
+    </w:p>
+    <w:p>
+      <w:pPr>
+        <w:spacing w:after="40"/>
+      </w:pPr>
+      <w:r>
+        <w:rPr>
+          <w:b/>
+          <w:sz w:val="22"/>
+        </w:rPr>
+        <w:t xml:space="preserve">Затронутые файлы:</w:t>
+      </w:r>
+    </w:p>
+    <w:p>
+      <w:pPr>
+        <w:numPr>
+          <w:ilvl w:val="0"/>
+          <w:numId w:val="1"/>
+        </w:numPr>
+        <w:spacing w:after="60"/>
+      </w:pPr>
+      <w:r>
+        <w:rPr>
+          <w:color w:val="333333"/>
+          <w:sz w:val="20"/>
+        </w:rPr>
+        <w:t xml:space="preserve">Assets/Prefab/UI/PurchaseHistoryEntry.prefab</w:t>
+      </w:r>
+    </w:p>
+    <w:p>
+      <w:pPr>
+        <w:numPr>
+          <w:ilvl w:val="0"/>
+          <w:numId w:val="1"/>
+        </w:numPr>
+        <w:spacing w:after="60"/>
+      </w:pPr>
+      <w:r>
+        <w:rPr>
+          <w:color w:val="333333"/>
+          <w:sz w:val="20"/>
+        </w:rPr>
+        <w:t xml:space="preserve">Assets/Scenes/MainScene.unity</w:t>
+      </w:r>
+    </w:p>
+    <w:p>
+      <w:pPr>
+        <w:numPr>
+          <w:ilvl w:val="0"/>
+          <w:numId w:val="1"/>
+        </w:numPr>
+        <w:spacing w:after="60"/>
+      </w:pPr>
+      <w:r>
+        <w:rPr>
+          <w:color w:val="333333"/>
+          <w:sz w:val="20"/>
+        </w:rPr>
+        <w:t xml:space="preserve">Assets/Script/ShopManager.cs</w:t>
+      </w:r>
+    </w:p>
+    <w:p>
+      <w:pPr>
+        <w:numPr>
+          <w:ilvl w:val="0"/>
+          <w:numId w:val="1"/>
+        </w:numPr>
+        <w:spacing w:after="60"/>
+      </w:pPr>
+      <w:r>
+        <w:rPr>
+          <w:color w:val="333333"/>
+          <w:sz w:val="20"/>
+        </w:rPr>
+        <w:t xml:space="preserve">Assets/Script/UI/PurchaseHistoryEntry.cs</w:t>
+      </w:r>
+    </w:p>
+    <w:p>
+      <w:pPr>
+        <w:numPr>
+          <w:ilvl w:val="0"/>
+          <w:numId w:val="1"/>
+        </w:numPr>
+        <w:spacing w:after="60"/>
+      </w:pPr>
+      <w:r>
+        <w:rPr>
+          <w:color w:val="333333"/>
+          <w:sz w:val="20"/>
+        </w:rPr>
+        <w:t xml:space="preserve">Assets/Script/UI/PurchaseHistoryManager.cs</w:t>
+      </w:r>
+    </w:p>
+    <w:p>
+      <w:pPr>
+        <w:numPr>
+          <w:ilvl w:val="0"/>
+          <w:numId w:val="1"/>
+        </w:numPr>
+        <w:spacing w:after="60"/>
+      </w:pPr>
+      <w:r>
+        <w:rPr>
+          <w:color w:val="333333"/>
+          <w:sz w:val="20"/>
+        </w:rPr>
+        <w:t xml:space="preserve">"docs/\320\230\321\201\321\202\320\276\321\200\320\270\321\217_\320\270\320\267\320\274\320\265\320\275\320\265\320\275\320\270\320\271.docx"</w:t>
+      </w:r>
+    </w:p>
+    <w:p>
+      <w:pPr>
+        <w:spacing w:after="120"/>
+      </w:pPr>
+      <w:r>
+        <w:rPr>
+          <w:sz w:val="10"/>
+        </w:rPr>
+        <w:t xml:space="preserve"> </w:t>
+      </w:r>
+    </w:p>
+    <w:p>
+      <w:pPr>
+        <w:spacing w:after="40"/>
+      </w:pPr>
+      <w:r>
+        <w:rPr>
+          <w:b/>
+          <w:sz w:val="28"/>
+        </w:rPr>
+        <w:t xml:space="preserve">14. </w:t>
+      </w:r>
+      <w:r>
+        <w:rPr>
+          <w:b/>
+          <w:color w:val="B22222"/>
+          <w:sz w:val="28"/>
+        </w:rPr>
+        <w:t xml:space="preserve">[FIX] </w:t>
+      </w:r>
+      <w:r>
+        <w:rPr>
+          <w:b/>
+          <w:sz w:val="28"/>
+        </w:rPr>
+        <w:t xml:space="preserve">projectile bugs (ice arrow facing, missile orbiting, MagicCircle no damage)</w:t>
+      </w:r>
+    </w:p>
+    <w:p>
+      <w:pPr>
+        <w:spacing w:after="120"/>
+      </w:pPr>
+      <w:r>
+        <w:rPr>
+          <w:i/>
+          <w:color w:val="666666"/>
+          <w:sz w:val="20"/>
+        </w:rPr>
         <w:t xml:space="preserve">Коммит (готовится) · —  (блок обновится настоящим хэшем после коммита)</w:t>
       </w:r>
     </w:p>
@@ -3440,71 +3701,87 @@
           <w:color w:val="333333"/>
           <w:sz w:val="20"/>
         </w:rPr>
-        <w:t xml:space="preserve">Assets/Prefab/UI/PurchaseHistoryEntry.prefab</w:t>
-      </w:r>
-    </w:p>
-    <w:p>
-      <w:pPr>
-        <w:numPr>
-          <w:ilvl w:val="0"/>
-          <w:numId w:val="1"/>
-        </w:numPr>
-        <w:spacing w:after="60"/>
-      </w:pPr>
-      <w:r>
-        <w:rPr>
-          <w:color w:val="333333"/>
-          <w:sz w:val="20"/>
-        </w:rPr>
-        <w:t xml:space="preserve">Assets/Scenes/MainScene.unity</w:t>
-      </w:r>
-    </w:p>
-    <w:p>
-      <w:pPr>
-        <w:numPr>
-          <w:ilvl w:val="0"/>
-          <w:numId w:val="1"/>
-        </w:numPr>
-        <w:spacing w:after="60"/>
-      </w:pPr>
-      <w:r>
-        <w:rPr>
-          <w:color w:val="333333"/>
-          <w:sz w:val="20"/>
-        </w:rPr>
-        <w:t xml:space="preserve">Assets/Script/ShopManager.cs</w:t>
-      </w:r>
-    </w:p>
-    <w:p>
-      <w:pPr>
-        <w:numPr>
-          <w:ilvl w:val="0"/>
-          <w:numId w:val="1"/>
-        </w:numPr>
-        <w:spacing w:after="60"/>
-      </w:pPr>
-      <w:r>
-        <w:rPr>
-          <w:color w:val="333333"/>
-          <w:sz w:val="20"/>
-        </w:rPr>
-        <w:t xml:space="preserve">Assets/Script/UI/PurchaseHistoryEntry.cs</w:t>
-      </w:r>
-    </w:p>
-    <w:p>
-      <w:pPr>
-        <w:numPr>
-          <w:ilvl w:val="0"/>
-          <w:numId w:val="1"/>
-        </w:numPr>
-        <w:spacing w:after="60"/>
-      </w:pPr>
-      <w:r>
-        <w:rPr>
-          <w:color w:val="333333"/>
-          <w:sz w:val="20"/>
-        </w:rPr>
-        <w:t xml:space="preserve">Assets/Script/UI/PurchaseHistoryManager.cs</w:t>
+        <w:t xml:space="preserve">Assets/Prefab/Weapon/2Tier/IceBullet_Projectile.prefab</w:t>
+      </w:r>
+    </w:p>
+    <w:p>
+      <w:pPr>
+        <w:numPr>
+          <w:ilvl w:val="0"/>
+          <w:numId w:val="1"/>
+        </w:numPr>
+        <w:spacing w:after="60"/>
+      </w:pPr>
+      <w:r>
+        <w:rPr>
+          <w:color w:val="333333"/>
+          <w:sz w:val="20"/>
+        </w:rPr>
+        <w:t xml:space="preserve">Assets/Prefab/Weapon/2Tier/MisslesProjectile.prefab</w:t>
+      </w:r>
+    </w:p>
+    <w:p>
+      <w:pPr>
+        <w:numPr>
+          <w:ilvl w:val="0"/>
+          <w:numId w:val="1"/>
+        </w:numPr>
+        <w:spacing w:after="60"/>
+      </w:pPr>
+      <w:r>
+        <w:rPr>
+          <w:color w:val="333333"/>
+          <w:sz w:val="20"/>
+        </w:rPr>
+        <w:t xml:space="preserve">Assets/Script/BulletType/Bullet.cs</w:t>
+      </w:r>
+    </w:p>
+    <w:p>
+      <w:pPr>
+        <w:numPr>
+          <w:ilvl w:val="0"/>
+          <w:numId w:val="1"/>
+        </w:numPr>
+        <w:spacing w:after="60"/>
+      </w:pPr>
+      <w:r>
+        <w:rPr>
+          <w:color w:val="333333"/>
+          <w:sz w:val="20"/>
+        </w:rPr>
+        <w:t xml:space="preserve">Assets/Script/BulletType/MisslesBullet.cs</w:t>
+      </w:r>
+    </w:p>
+    <w:p>
+      <w:pPr>
+        <w:numPr>
+          <w:ilvl w:val="0"/>
+          <w:numId w:val="1"/>
+        </w:numPr>
+        <w:spacing w:after="60"/>
+      </w:pPr>
+      <w:r>
+        <w:rPr>
+          <w:color w:val="333333"/>
+          <w:sz w:val="20"/>
+        </w:rPr>
+        <w:t xml:space="preserve">Assets/Script/BulletType/ScalingWave.cs</w:t>
+      </w:r>
+    </w:p>
+    <w:p>
+      <w:pPr>
+        <w:numPr>
+          <w:ilvl w:val="0"/>
+          <w:numId w:val="1"/>
+        </w:numPr>
+        <w:spacing w:after="60"/>
+      </w:pPr>
+      <w:r>
+        <w:rPr>
+          <w:color w:val="333333"/>
+          <w:sz w:val="20"/>
+        </w:rPr>
+        <w:t xml:space="preserve">Assets/Script/BulletType/SpawnBulletOffset.cs</w:t>
       </w:r>
     </w:p>
     <w:p>

</xml_diff>

<commit_message>
perf: UI-текстуры Max Size 2048 -> 1024
76 UI-спрайтов (Assets/Texture: UI, HpBar, Ui_template, new + корневые) уменьшены
2048 -> 1024, crunch сохранён. По Build Report текстуры = 73% билда, и топ-'пожиратели'
были именно UI на 2048 (txt_main 6.2, goldcoin/ToolTipUi 4.2 МБ и т.д.). 1024 при
референсе 2560x1440 визуально достаточно; ~4x меньше на каждую.
</commit_message>
<xml_diff>
--- a/docs/История_изменений.docx
+++ b/docs/История_изменений.docx
@@ -47,7 +47,7 @@
           <w:b/>
           <w:sz w:val="22"/>
         </w:rPr>
-        <w:t xml:space="preserve">Всего коммитов: 27</w:t>
+        <w:t xml:space="preserve">Всего коммитов: 28</w:t>
       </w:r>
     </w:p>
     <w:p>
@@ -12284,7 +12284,624 @@
           <w:b/>
           <w:sz w:val="28"/>
         </w:rPr>
-        <w:t xml:space="preserve">static batching окружения (Terrain) + GPU Instancing на материалах</w:t>
+        <w:t xml:space="preserve">static batching окружения + GPU Instancing на материалах</w:t>
+      </w:r>
+    </w:p>
+    <w:p>
+      <w:pPr>
+        <w:spacing w:after="120"/>
+      </w:pPr>
+      <w:r>
+        <w:rPr>
+          <w:i/>
+          <w:color w:val="666666"/>
+          <w:sz w:val="20"/>
+        </w:rPr>
+        <w:t xml:space="preserve">Коммит 0923857 · 2026-07-08</w:t>
+      </w:r>
+    </w:p>
+    <w:p>
+      <w:pPr>
+        <w:spacing w:after="40"/>
+      </w:pPr>
+      <w:r>
+        <w:rPr>
+          <w:b/>
+          <w:sz w:val="22"/>
+        </w:rPr>
+        <w:t xml:space="preserve">Описание:</w:t>
+      </w:r>
+    </w:p>
+    <w:p>
+      <w:pPr>
+        <w:numPr>
+          <w:ilvl w:val="0"/>
+          <w:numId w:val="1"/>
+        </w:numPr>
+        <w:spacing w:after="60"/>
+      </w:pPr>
+      <w:r>
+        <w:rPr>
+          <w:sz w:val="22"/>
+        </w:rPr>
+        <w:t xml:space="preserve">Помечено Batching Static всё неподвижное окружение под 'Terrain' (600 рендереров; анимированное/физика пропущены). В play mode: 25 static-батчей, 924 static-batched draw call'а (было ~0), SetPass calls ~180 под URP SRP Batcher.</w:t>
+      </w:r>
+    </w:p>
+    <w:p>
+      <w:pPr>
+        <w:numPr>
+          <w:ilvl w:val="0"/>
+          <w:numId w:val="1"/>
+        </w:numPr>
+        <w:spacing w:after="60"/>
+      </w:pPr>
+      <w:r>
+        <w:rPr>
+          <w:sz w:val="22"/>
+        </w:rPr>
+        <w:t xml:space="preserve">Включён GPU Instancing на 30 материалах окружения (камни/деревья/трава/пропы).</w:t>
+      </w:r>
+    </w:p>
+    <w:p>
+      <w:pPr>
+        <w:spacing w:after="40"/>
+      </w:pPr>
+      <w:r>
+        <w:rPr>
+          <w:b/>
+          <w:sz w:val="22"/>
+        </w:rPr>
+        <w:t xml:space="preserve">Затронутые файлы:</w:t>
+      </w:r>
+    </w:p>
+    <w:p>
+      <w:pPr>
+        <w:numPr>
+          <w:ilvl w:val="0"/>
+          <w:numId w:val="1"/>
+        </w:numPr>
+        <w:spacing w:after="60"/>
+      </w:pPr>
+      <w:r>
+        <w:rPr>
+          <w:color w:val="333333"/>
+          <w:sz w:val="20"/>
+        </w:rPr>
+        <w:t xml:space="preserve">Assets/AssetStore/Easy3D/Stylized Farm Asset Pack - Small/Materials/FenceMaterial.mat</w:t>
+      </w:r>
+    </w:p>
+    <w:p>
+      <w:pPr>
+        <w:numPr>
+          <w:ilvl w:val="0"/>
+          <w:numId w:val="1"/>
+        </w:numPr>
+        <w:spacing w:after="60"/>
+      </w:pPr>
+      <w:r>
+        <w:rPr>
+          <w:color w:val="333333"/>
+          <w:sz w:val="20"/>
+        </w:rPr>
+        <w:t xml:space="preserve">Assets/AssetStore/Easy3D/Stylized Farm Asset Pack - Small/Materials/WheelMaterial.mat</w:t>
+      </w:r>
+    </w:p>
+    <w:p>
+      <w:pPr>
+        <w:numPr>
+          <w:ilvl w:val="0"/>
+          <w:numId w:val="1"/>
+        </w:numPr>
+        <w:spacing w:after="60"/>
+      </w:pPr>
+      <w:r>
+        <w:rPr>
+          <w:color w:val="333333"/>
+          <w:sz w:val="20"/>
+        </w:rPr>
+        <w:t xml:space="preserve">Assets/AssetStore/Easy3D/Stylized Farm Asset Pack - Small/Materials/WoodenSignMaterial.mat</w:t>
+      </w:r>
+    </w:p>
+    <w:p>
+      <w:pPr>
+        <w:numPr>
+          <w:ilvl w:val="0"/>
+          <w:numId w:val="1"/>
+        </w:numPr>
+        <w:spacing w:after="60"/>
+      </w:pPr>
+      <w:r>
+        <w:rPr>
+          <w:color w:val="333333"/>
+          <w:sz w:val="20"/>
+        </w:rPr>
+        <w:t xml:space="preserve">Assets/AssetStore/Idyllic Fantasy Nature/Materials/Branches/Branch.mat</w:t>
+      </w:r>
+    </w:p>
+    <w:p>
+      <w:pPr>
+        <w:numPr>
+          <w:ilvl w:val="0"/>
+          <w:numId w:val="1"/>
+        </w:numPr>
+        <w:spacing w:after="60"/>
+      </w:pPr>
+      <w:r>
+        <w:rPr>
+          <w:color w:val="333333"/>
+          <w:sz w:val="20"/>
+        </w:rPr>
+        <w:t xml:space="preserve">Assets/AssetStore/Idyllic Fantasy Nature/Materials/Bushes/Bush_03.mat</w:t>
+      </w:r>
+    </w:p>
+    <w:p>
+      <w:pPr>
+        <w:numPr>
+          <w:ilvl w:val="0"/>
+          <w:numId w:val="1"/>
+        </w:numPr>
+        <w:spacing w:after="60"/>
+      </w:pPr>
+      <w:r>
+        <w:rPr>
+          <w:color w:val="333333"/>
+          <w:sz w:val="20"/>
+        </w:rPr>
+        <w:t xml:space="preserve">Assets/AssetStore/Idyllic Fantasy Nature/Materials/Flowers/Flower.mat</w:t>
+      </w:r>
+    </w:p>
+    <w:p>
+      <w:pPr>
+        <w:numPr>
+          <w:ilvl w:val="0"/>
+          <w:numId w:val="1"/>
+        </w:numPr>
+        <w:spacing w:after="60"/>
+      </w:pPr>
+      <w:r>
+        <w:rPr>
+          <w:color w:val="333333"/>
+          <w:sz w:val="20"/>
+        </w:rPr>
+        <w:t xml:space="preserve">Assets/AssetStore/Idyllic Fantasy Nature/Materials/Rocks/Rock_Big_02.mat</w:t>
+      </w:r>
+    </w:p>
+    <w:p>
+      <w:pPr>
+        <w:numPr>
+          <w:ilvl w:val="0"/>
+          <w:numId w:val="1"/>
+        </w:numPr>
+        <w:spacing w:after="60"/>
+      </w:pPr>
+      <w:r>
+        <w:rPr>
+          <w:color w:val="333333"/>
+          <w:sz w:val="20"/>
+        </w:rPr>
+        <w:t xml:space="preserve">Assets/AssetStore/Idyllic Fantasy Nature/Materials/Rocks/Rock_Big_03.mat</w:t>
+      </w:r>
+    </w:p>
+    <w:p>
+      <w:pPr>
+        <w:numPr>
+          <w:ilvl w:val="0"/>
+          <w:numId w:val="1"/>
+        </w:numPr>
+        <w:spacing w:after="60"/>
+      </w:pPr>
+      <w:r>
+        <w:rPr>
+          <w:color w:val="333333"/>
+          <w:sz w:val="20"/>
+        </w:rPr>
+        <w:t xml:space="preserve">Assets/AssetStore/Idyllic Fantasy Nature/Materials/Rocks/Rock_Medium_01.mat</w:t>
+      </w:r>
+    </w:p>
+    <w:p>
+      <w:pPr>
+        <w:numPr>
+          <w:ilvl w:val="0"/>
+          <w:numId w:val="1"/>
+        </w:numPr>
+        <w:spacing w:after="60"/>
+      </w:pPr>
+      <w:r>
+        <w:rPr>
+          <w:color w:val="333333"/>
+          <w:sz w:val="20"/>
+        </w:rPr>
+        <w:t xml:space="preserve">Assets/AssetStore/Idyllic Fantasy Nature/Materials/Rocks/Rock_Medium_02.mat</w:t>
+      </w:r>
+    </w:p>
+    <w:p>
+      <w:pPr>
+        <w:numPr>
+          <w:ilvl w:val="0"/>
+          <w:numId w:val="1"/>
+        </w:numPr>
+        <w:spacing w:after="60"/>
+      </w:pPr>
+      <w:r>
+        <w:rPr>
+          <w:color w:val="333333"/>
+          <w:sz w:val="20"/>
+        </w:rPr>
+        <w:t xml:space="preserve">Assets/AssetStore/Idyllic Fantasy Nature/Materials/Rocks/Rock_Medium_03.mat</w:t>
+      </w:r>
+    </w:p>
+    <w:p>
+      <w:pPr>
+        <w:numPr>
+          <w:ilvl w:val="0"/>
+          <w:numId w:val="1"/>
+        </w:numPr>
+        <w:spacing w:after="60"/>
+      </w:pPr>
+      <w:r>
+        <w:rPr>
+          <w:color w:val="333333"/>
+          <w:sz w:val="20"/>
+        </w:rPr>
+        <w:t xml:space="preserve">Assets/AssetStore/Idyllic Fantasy Nature/Materials/Rocks/Rock_Small_01.mat</w:t>
+      </w:r>
+    </w:p>
+    <w:p>
+      <w:pPr>
+        <w:numPr>
+          <w:ilvl w:val="0"/>
+          <w:numId w:val="1"/>
+        </w:numPr>
+        <w:spacing w:after="60"/>
+      </w:pPr>
+      <w:r>
+        <w:rPr>
+          <w:color w:val="333333"/>
+          <w:sz w:val="20"/>
+        </w:rPr>
+        <w:t xml:space="preserve">Assets/AssetStore/Idyllic Fantasy Nature/Materials/Rocks/Rock_Small_02.mat</w:t>
+      </w:r>
+    </w:p>
+    <w:p>
+      <w:pPr>
+        <w:numPr>
+          <w:ilvl w:val="0"/>
+          <w:numId w:val="1"/>
+        </w:numPr>
+        <w:spacing w:after="60"/>
+      </w:pPr>
+      <w:r>
+        <w:rPr>
+          <w:color w:val="333333"/>
+          <w:sz w:val="20"/>
+        </w:rPr>
+        <w:t xml:space="preserve">Assets/AssetStore/Idyllic Fantasy Nature/Materials/Rocks/Rock_Small_03.mat</w:t>
+      </w:r>
+    </w:p>
+    <w:p>
+      <w:pPr>
+        <w:numPr>
+          <w:ilvl w:val="0"/>
+          <w:numId w:val="1"/>
+        </w:numPr>
+        <w:spacing w:after="60"/>
+      </w:pPr>
+      <w:r>
+        <w:rPr>
+          <w:color w:val="333333"/>
+          <w:sz w:val="20"/>
+        </w:rPr>
+        <w:t xml:space="preserve">Assets/AssetStore/Idyllic Fantasy Nature/Materials/Rocks/Stone_Big_01.mat</w:t>
+      </w:r>
+    </w:p>
+    <w:p>
+      <w:pPr>
+        <w:numPr>
+          <w:ilvl w:val="0"/>
+          <w:numId w:val="1"/>
+        </w:numPr>
+        <w:spacing w:after="60"/>
+      </w:pPr>
+      <w:r>
+        <w:rPr>
+          <w:color w:val="333333"/>
+          <w:sz w:val="20"/>
+        </w:rPr>
+        <w:t xml:space="preserve">Assets/AssetStore/Idyllic Fantasy Nature/Materials/Rocks/Stone_Big_02.mat</w:t>
+      </w:r>
+    </w:p>
+    <w:p>
+      <w:pPr>
+        <w:numPr>
+          <w:ilvl w:val="0"/>
+          <w:numId w:val="1"/>
+        </w:numPr>
+        <w:spacing w:after="60"/>
+      </w:pPr>
+      <w:r>
+        <w:rPr>
+          <w:color w:val="333333"/>
+          <w:sz w:val="20"/>
+        </w:rPr>
+        <w:t xml:space="preserve">Assets/AssetStore/Idyllic Fantasy Nature/Materials/Rocks/Stone_Big_03.mat</w:t>
+      </w:r>
+    </w:p>
+    <w:p>
+      <w:pPr>
+        <w:numPr>
+          <w:ilvl w:val="0"/>
+          <w:numId w:val="1"/>
+        </w:numPr>
+        <w:spacing w:after="60"/>
+      </w:pPr>
+      <w:r>
+        <w:rPr>
+          <w:color w:val="333333"/>
+          <w:sz w:val="20"/>
+        </w:rPr>
+        <w:t xml:space="preserve">Assets/AssetStore/Idyllic Fantasy Nature/Materials/Rocks/Stone_Medium_01.mat</w:t>
+      </w:r>
+    </w:p>
+    <w:p>
+      <w:pPr>
+        <w:numPr>
+          <w:ilvl w:val="0"/>
+          <w:numId w:val="1"/>
+        </w:numPr>
+        <w:spacing w:after="60"/>
+      </w:pPr>
+      <w:r>
+        <w:rPr>
+          <w:color w:val="333333"/>
+          <w:sz w:val="20"/>
+        </w:rPr>
+        <w:t xml:space="preserve">Assets/AssetStore/Idyllic Fantasy Nature/Materials/Rocks/Stone_Medium_02.mat</w:t>
+      </w:r>
+    </w:p>
+    <w:p>
+      <w:pPr>
+        <w:numPr>
+          <w:ilvl w:val="0"/>
+          <w:numId w:val="1"/>
+        </w:numPr>
+        <w:spacing w:after="60"/>
+      </w:pPr>
+      <w:r>
+        <w:rPr>
+          <w:color w:val="333333"/>
+          <w:sz w:val="20"/>
+        </w:rPr>
+        <w:t xml:space="preserve">Assets/AssetStore/Idyllic Fantasy Nature/Materials/Rocks/Stone_Medium_03.mat</w:t>
+      </w:r>
+    </w:p>
+    <w:p>
+      <w:pPr>
+        <w:numPr>
+          <w:ilvl w:val="0"/>
+          <w:numId w:val="1"/>
+        </w:numPr>
+        <w:spacing w:after="60"/>
+      </w:pPr>
+      <w:r>
+        <w:rPr>
+          <w:color w:val="333333"/>
+          <w:sz w:val="20"/>
+        </w:rPr>
+        <w:t xml:space="preserve">Assets/AssetStore/Idyllic Fantasy Nature/Materials/Trees/Broadleaf_Green.mat</w:t>
+      </w:r>
+    </w:p>
+    <w:p>
+      <w:pPr>
+        <w:numPr>
+          <w:ilvl w:val="0"/>
+          <w:numId w:val="1"/>
+        </w:numPr>
+        <w:spacing w:after="60"/>
+      </w:pPr>
+      <w:r>
+        <w:rPr>
+          <w:color w:val="333333"/>
+          <w:sz w:val="20"/>
+        </w:rPr>
+        <w:t xml:space="preserve">Assets/AssetStore/Idyllic Fantasy Nature/Materials/Trees/Broadleaf_Red.mat</w:t>
+      </w:r>
+    </w:p>
+    <w:p>
+      <w:pPr>
+        <w:numPr>
+          <w:ilvl w:val="0"/>
+          <w:numId w:val="1"/>
+        </w:numPr>
+        <w:spacing w:after="60"/>
+      </w:pPr>
+      <w:r>
+        <w:rPr>
+          <w:color w:val="333333"/>
+          <w:sz w:val="20"/>
+        </w:rPr>
+        <w:t xml:space="preserve">Assets/AssetStore/Idyllic Fantasy Nature/Materials/Trees/Tree_Bark.mat</w:t>
+      </w:r>
+    </w:p>
+    <w:p>
+      <w:pPr>
+        <w:numPr>
+          <w:ilvl w:val="0"/>
+          <w:numId w:val="1"/>
+        </w:numPr>
+        <w:spacing w:after="60"/>
+      </w:pPr>
+      <w:r>
+        <w:rPr>
+          <w:color w:val="333333"/>
+          <w:sz w:val="20"/>
+        </w:rPr>
+        <w:t xml:space="preserve">Assets/AssetStore/Idyllic Fantasy Nature/Materials/Trees/Willow_Branch_Green.mat</w:t>
+      </w:r>
+    </w:p>
+    <w:p>
+      <w:pPr>
+        <w:numPr>
+          <w:ilvl w:val="0"/>
+          <w:numId w:val="1"/>
+        </w:numPr>
+        <w:spacing w:after="60"/>
+      </w:pPr>
+      <w:r>
+        <w:rPr>
+          <w:color w:val="333333"/>
+          <w:sz w:val="20"/>
+        </w:rPr>
+        <w:t xml:space="preserve">Assets/AssetStore/Idyllic Fantasy Nature/Materials/Waterplants/Reeds_01.mat</w:t>
+      </w:r>
+    </w:p>
+    <w:p>
+      <w:pPr>
+        <w:numPr>
+          <w:ilvl w:val="0"/>
+          <w:numId w:val="1"/>
+        </w:numPr>
+        <w:spacing w:after="60"/>
+      </w:pPr>
+      <w:r>
+        <w:rPr>
+          <w:color w:val="333333"/>
+          <w:sz w:val="20"/>
+        </w:rPr>
+        <w:t xml:space="preserve">Assets/AssetStore/Idyllic Fantasy Nature/Materials/Waterplants/Reeds_02.mat</w:t>
+      </w:r>
+    </w:p>
+    <w:p>
+      <w:pPr>
+        <w:numPr>
+          <w:ilvl w:val="0"/>
+          <w:numId w:val="1"/>
+        </w:numPr>
+        <w:spacing w:after="60"/>
+      </w:pPr>
+      <w:r>
+        <w:rPr>
+          <w:color w:val="333333"/>
+          <w:sz w:val="20"/>
+        </w:rPr>
+        <w:t xml:space="preserve">Assets/AssetStore/Idyllic Fantasy Nature/Materials/Waterplants/Reeds_03.mat</w:t>
+      </w:r>
+    </w:p>
+    <w:p>
+      <w:pPr>
+        <w:numPr>
+          <w:ilvl w:val="0"/>
+          <w:numId w:val="1"/>
+        </w:numPr>
+        <w:spacing w:after="60"/>
+      </w:pPr>
+      <w:r>
+        <w:rPr>
+          <w:color w:val="333333"/>
+          <w:sz w:val="20"/>
+        </w:rPr>
+        <w:t xml:space="preserve">Assets/AssetStore/Idyllic Fantasy Nature/Materials/Waterplants/Waterlily.mat</w:t>
+      </w:r>
+    </w:p>
+    <w:p>
+      <w:pPr>
+        <w:numPr>
+          <w:ilvl w:val="0"/>
+          <w:numId w:val="1"/>
+        </w:numPr>
+        <w:spacing w:after="60"/>
+      </w:pPr>
+      <w:r>
+        <w:rPr>
+          <w:color w:val="333333"/>
+          <w:sz w:val="20"/>
+        </w:rPr>
+        <w:t xml:space="preserve">Assets/AssetStore/Idyllic Fantasy Nature/Materials/Waterplants/Waterlily_Bottom.mat</w:t>
+      </w:r>
+    </w:p>
+    <w:p>
+      <w:pPr>
+        <w:numPr>
+          <w:ilvl w:val="0"/>
+          <w:numId w:val="1"/>
+        </w:numPr>
+        <w:spacing w:after="60"/>
+      </w:pPr>
+      <w:r>
+        <w:rPr>
+          <w:color w:val="333333"/>
+          <w:sz w:val="20"/>
+        </w:rPr>
+        <w:t xml:space="preserve">Assets/AssetStore/Tower/Materials/Tower.mat</w:t>
+      </w:r>
+    </w:p>
+    <w:p>
+      <w:pPr>
+        <w:numPr>
+          <w:ilvl w:val="0"/>
+          <w:numId w:val="1"/>
+        </w:numPr>
+        <w:spacing w:after="60"/>
+      </w:pPr>
+      <w:r>
+        <w:rPr>
+          <w:color w:val="333333"/>
+          <w:sz w:val="20"/>
+        </w:rPr>
+        <w:t xml:space="preserve">Assets/Scenes/MainScene.unity</w:t>
+      </w:r>
+    </w:p>
+    <w:p>
+      <w:pPr>
+        <w:numPr>
+          <w:ilvl w:val="0"/>
+          <w:numId w:val="1"/>
+        </w:numPr>
+        <w:spacing w:after="60"/>
+      </w:pPr>
+      <w:r>
+        <w:rPr>
+          <w:color w:val="333333"/>
+          <w:sz w:val="20"/>
+        </w:rPr>
+        <w:t xml:space="preserve">"docs/\320\230\321\201\321\202\320\276\321\200\320\270\321\217_\320\270\320\267\320\274\320\265\320\275\320\265\320\275\320\270\320\271.docx"</w:t>
+      </w:r>
+    </w:p>
+    <w:p>
+      <w:pPr>
+        <w:spacing w:after="120"/>
+      </w:pPr>
+      <w:r>
+        <w:rPr>
+          <w:sz w:val="10"/>
+        </w:rPr>
+        <w:t xml:space="preserve"> </w:t>
+      </w:r>
+    </w:p>
+    <w:p>
+      <w:pPr>
+        <w:spacing w:after="40"/>
+      </w:pPr>
+      <w:r>
+        <w:rPr>
+          <w:b/>
+          <w:sz w:val="28"/>
+        </w:rPr>
+        <w:t xml:space="preserve">29. </w:t>
+      </w:r>
+      <w:r>
+        <w:rPr>
+          <w:b/>
+          <w:color w:val="1F5FB2"/>
+          <w:sz w:val="28"/>
+        </w:rPr>
+        <w:t xml:space="preserve">[PERF] </w:t>
+      </w:r>
+      <w:r>
+        <w:rPr>
+          <w:b/>
+          <w:sz w:val="28"/>
+        </w:rPr>
+        <w:t xml:space="preserve">UI-текстуры Max Size 2048 -&gt; 1024 (crunch сохранён)</w:t>
       </w:r>
     </w:p>
     <w:p>

</xml_diff>